<commit_message>
P9 - periksa lalu simpan
</commit_message>
<xml_diff>
--- a/worksheet-p9/25523236-Diah Putri Pertiwi.docx
+++ b/worksheet-p9/25523236-Diah Putri Pertiwi.docx
@@ -12464,24 +12464,11 @@
               <w:right w:val="single" w:sz="4" w:space="0" w:color="B9C6E2"/>
             </w:tcBorders>
           </w:tcPr>
-          <w:p/>
-        </w:tc>
-      </w:tr>
-      <w:tr>
-        <w:trPr>
-          <w:trHeight w:val="351"/>
-        </w:trPr>
-        <w:tc>
-          <w:tcPr>
-            <w:tcW w:w="9751" w:type="dxa"/>
-            <w:tcBorders>
-              <w:top w:val="single" w:sz="4" w:space="0" w:color="B9C6E2"/>
-              <w:left w:val="single" w:sz="4" w:space="0" w:color="B9C6E2"/>
-              <w:bottom w:val="single" w:sz="4" w:space="0" w:color="B9C6E2"/>
-              <w:right w:val="single" w:sz="4" w:space="0" w:color="B9C6E2"/>
-            </w:tcBorders>
-          </w:tcPr>
-          <w:p/>
+          <w:p>
+            <w:r>
+              <w:t>Elemen daftar proyek diambil menggunakan pemilih #daftar dan disimpan ke dalam variabel konstan bernama wadah.</w:t>
+            </w:r>
+          </w:p>
         </w:tc>
       </w:tr>
     </w:tbl>
@@ -12526,24 +12513,21 @@
               <w:right w:val="single" w:sz="4" w:space="0" w:color="B9C6E2"/>
             </w:tcBorders>
           </w:tcPr>
-          <w:p/>
-        </w:tc>
-      </w:tr>
-      <w:tr>
-        <w:trPr>
-          <w:trHeight w:val="351"/>
-        </w:trPr>
-        <w:tc>
-          <w:tcPr>
-            <w:tcW w:w="9751" w:type="dxa"/>
-            <w:tcBorders>
-              <w:top w:val="single" w:sz="4" w:space="0" w:color="B9C6E2"/>
-              <w:left w:val="single" w:sz="4" w:space="0" w:color="B9C6E2"/>
-              <w:bottom w:val="single" w:sz="4" w:space="0" w:color="B9C6E2"/>
-              <w:right w:val="single" w:sz="4" w:space="0" w:color="B9C6E2"/>
-            </w:tcBorders>
-          </w:tcPr>
-          <w:p/>
+          <w:p>
+            <w:r>
+              <w:t xml:space="preserve">querySelector mengembalikan satu elemen pertama yang cocok, sedangkan querySelectorAll mengembalikan seluruh elemen yang cocok sebagai bentuk NodeList. Map tidak bisa langsung dipakai pada NodeList karena itu bukan </w:t>
+            </w:r>
+            <w:r>
+              <w:rPr>
+                <w:i/>
+                <w:iCs/>
+              </w:rPr>
+              <w:t>array</w:t>
+            </w:r>
+            <w:r>
+              <w:t xml:space="preserve"> murni (harus diubah dulu dengan Array.from()).</w:t>
+            </w:r>
+          </w:p>
         </w:tc>
       </w:tr>
     </w:tbl>
@@ -12588,24 +12572,21 @@
               <w:right w:val="single" w:sz="4" w:space="0" w:color="B9C6E2"/>
             </w:tcBorders>
           </w:tcPr>
-          <w:p/>
-        </w:tc>
-      </w:tr>
-      <w:tr>
-        <w:trPr>
-          <w:trHeight w:val="351"/>
-        </w:trPr>
-        <w:tc>
-          <w:tcPr>
-            <w:tcW w:w="9751" w:type="dxa"/>
-            <w:tcBorders>
-              <w:top w:val="single" w:sz="4" w:space="0" w:color="B9C6E2"/>
-              <w:left w:val="single" w:sz="4" w:space="0" w:color="B9C6E2"/>
-              <w:bottom w:val="single" w:sz="4" w:space="0" w:color="B9C6E2"/>
-              <w:right w:val="single" w:sz="4" w:space="0" w:color="B9C6E2"/>
-            </w:tcBorders>
-          </w:tcPr>
-          <w:p/>
+          <w:p>
+            <w:r>
+              <w:t xml:space="preserve">Cukup pasang satu </w:t>
+            </w:r>
+            <w:r>
+              <w:rPr>
+                <w:i/>
+                <w:iCs/>
+              </w:rPr>
+              <w:t>event listener</w:t>
+            </w:r>
+            <w:r>
+              <w:t xml:space="preserve"> di elemen induk untuk melayani seluruh anak/tombol di dalamnya, termasuk elemen yang baru ditambahkan secara dinamis. Dibuktikan melalui baris barisFilter.addEventListener("click", ...).</w:t>
+            </w:r>
+          </w:p>
         </w:tc>
       </w:tr>
     </w:tbl>
@@ -12650,24 +12631,11 @@
               <w:right w:val="single" w:sz="4" w:space="0" w:color="B9C6E2"/>
             </w:tcBorders>
           </w:tcPr>
-          <w:p/>
-        </w:tc>
-      </w:tr>
-      <w:tr>
-        <w:trPr>
-          <w:trHeight w:val="351"/>
-        </w:trPr>
-        <w:tc>
-          <w:tcPr>
-            <w:tcW w:w="9751" w:type="dxa"/>
-            <w:tcBorders>
-              <w:top w:val="single" w:sz="4" w:space="0" w:color="B9C6E2"/>
-              <w:left w:val="single" w:sz="4" w:space="0" w:color="B9C6E2"/>
-              <w:bottom w:val="single" w:sz="4" w:space="0" w:color="B9C6E2"/>
-              <w:right w:val="single" w:sz="4" w:space="0" w:color="B9C6E2"/>
-            </w:tcBorders>
-          </w:tcPr>
-          <w:p/>
+          <w:p>
+            <w:r>
+              <w:t>Kartu proyek tidak akan dibersihkan terlebih dahulu, sehingga setiap kali tombol filter diklik, kartu-kartu baru akan bertumpuk dan berlipat-lipat memenuhi halaman.</w:t>
+            </w:r>
+          </w:p>
         </w:tc>
       </w:tr>
     </w:tbl>
@@ -12712,24 +12680,21 @@
               <w:right w:val="single" w:sz="4" w:space="0" w:color="B9C6E2"/>
             </w:tcBorders>
           </w:tcPr>
-          <w:p/>
-        </w:tc>
-      </w:tr>
-      <w:tr>
-        <w:trPr>
-          <w:trHeight w:val="351"/>
-        </w:trPr>
-        <w:tc>
-          <w:tcPr>
-            <w:tcW w:w="9751" w:type="dxa"/>
-            <w:tcBorders>
-              <w:top w:val="single" w:sz="4" w:space="0" w:color="B9C6E2"/>
-              <w:left w:val="single" w:sz="4" w:space="0" w:color="B9C6E2"/>
-              <w:bottom w:val="single" w:sz="4" w:space="0" w:color="B9C6E2"/>
-              <w:right w:val="single" w:sz="4" w:space="0" w:color="B9C6E2"/>
-            </w:tcBorders>
-          </w:tcPr>
-          <w:p/>
+          <w:p>
+            <w:r>
+              <w:t xml:space="preserve">Dapat menimbulkan celah keamanan kritis berupa </w:t>
+            </w:r>
+            <w:r>
+              <w:rPr>
+                <w:i/>
+                <w:iCs/>
+              </w:rPr>
+              <w:t>Cross-Site Scripting</w:t>
+            </w:r>
+            <w:r>
+              <w:t xml:space="preserve"> (XSS) di mana teks masukan pengguna dieksekusi sebagai kode oleh peramban. Sebagai gantinya, digunakan textContent yang secara aman memperlakukan data murni sebagai teks.</w:t>
+            </w:r>
+          </w:p>
         </w:tc>
       </w:tr>
     </w:tbl>
@@ -12791,7 +12756,15 @@
                 <w:color w:val="003796"/>
                 <w:sz w:val="22"/>
               </w:rPr>
-              <w:t>☐  Berkas  profil.html, seluruh CSS, js/app.js, dan js/dom.js ada di repositori dan terbuka tanpa galat di Console</w:t>
+              <w:sym w:font="Wingdings 2" w:char="F052"/>
+            </w:r>
+            <w:r>
+              <w:rPr>
+                <w:rFonts w:cs="Carlito"/>
+                <w:color w:val="003796"/>
+                <w:sz w:val="22"/>
+              </w:rPr>
+              <w:t xml:space="preserve">  Berkas  profil.html, seluruh CSS, js/app.js, dan js/dom.js ada di repositori dan terbuka tanpa galat di Console</w:t>
             </w:r>
           </w:p>
         </w:tc>
@@ -12817,7 +12790,23 @@
                 <w:color w:val="003796"/>
                 <w:sz w:val="22"/>
               </w:rPr>
-              <w:t>☐  Pemilih  setiap pemilih menghasilkan elemen; tidak ada satu pun yang bernilai null</w:t>
+              <w:sym w:font="Wingdings 2" w:char="F052"/>
+            </w:r>
+            <w:r>
+              <w:rPr>
+                <w:rFonts w:cs="Carlito"/>
+                <w:color w:val="003796"/>
+                <w:sz w:val="22"/>
+              </w:rPr>
+              <w:t xml:space="preserve"> </w:t>
+            </w:r>
+            <w:r>
+              <w:rPr>
+                <w:rFonts w:cs="Carlito"/>
+                <w:color w:val="003796"/>
+                <w:sz w:val="22"/>
+              </w:rPr>
+              <w:t xml:space="preserve">  Pemilih  setiap pemilih menghasilkan elemen; tidak ada satu pun yang bernilai null</w:t>
             </w:r>
           </w:p>
         </w:tc>
@@ -12843,7 +12832,23 @@
                 <w:color w:val="003796"/>
                 <w:sz w:val="22"/>
               </w:rPr>
-              <w:t>☐  Render dari data  daftar proyek terbentuk dari array dengan createElement dan textContent, bukan dari HTML yang ditulis tangan</w:t>
+              <w:sym w:font="Wingdings 2" w:char="F052"/>
+            </w:r>
+            <w:r>
+              <w:rPr>
+                <w:rFonts w:cs="Carlito"/>
+                <w:color w:val="003796"/>
+                <w:sz w:val="22"/>
+              </w:rPr>
+              <w:t xml:space="preserve"> </w:t>
+            </w:r>
+            <w:r>
+              <w:rPr>
+                <w:rFonts w:cs="Carlito"/>
+                <w:color w:val="003796"/>
+                <w:sz w:val="22"/>
+              </w:rPr>
+              <w:t xml:space="preserve"> Render dari data  daftar proyek terbentuk dari array dengan createElement dan textContent, bukan dari HTML yang ditulis tangan</w:t>
             </w:r>
           </w:p>
         </w:tc>
@@ -12869,7 +12874,23 @@
                 <w:color w:val="003796"/>
                 <w:sz w:val="22"/>
               </w:rPr>
-              <w:t>☐  Wadah  dikosongkan di baris pertama fungsi render, sehingga kartu tidak pernah berlipat</w:t>
+              <w:sym w:font="Wingdings 2" w:char="F052"/>
+            </w:r>
+            <w:r>
+              <w:rPr>
+                <w:rFonts w:cs="Carlito"/>
+                <w:color w:val="003796"/>
+                <w:sz w:val="22"/>
+              </w:rPr>
+              <w:t xml:space="preserve"> </w:t>
+            </w:r>
+            <w:r>
+              <w:rPr>
+                <w:rFonts w:cs="Carlito"/>
+                <w:color w:val="003796"/>
+                <w:sz w:val="22"/>
+              </w:rPr>
+              <w:t xml:space="preserve">  Wadah  dikosongkan di baris pertama fungsi render, sehingga kartu tidak pernah berlipat</w:t>
             </w:r>
           </w:p>
         </w:tc>
@@ -12895,7 +12916,23 @@
                 <w:color w:val="003796"/>
                 <w:sz w:val="22"/>
               </w:rPr>
-              <w:t>☐  Event delegation  satu pendengar di induk melayani semua tombol filter; event.target dan closest dipakai benar</w:t>
+              <w:sym w:font="Wingdings 2" w:char="F052"/>
+            </w:r>
+            <w:r>
+              <w:rPr>
+                <w:rFonts w:cs="Carlito"/>
+                <w:color w:val="003796"/>
+                <w:sz w:val="22"/>
+              </w:rPr>
+              <w:t xml:space="preserve"> </w:t>
+            </w:r>
+            <w:r>
+              <w:rPr>
+                <w:rFonts w:cs="Carlito"/>
+                <w:color w:val="003796"/>
+                <w:sz w:val="22"/>
+              </w:rPr>
+              <w:t xml:space="preserve">  Event delegation  satu pendengar di induk melayani semua tombol filter; event.target dan closest dipakai benar</w:t>
             </w:r>
           </w:p>
         </w:tc>
@@ -12921,7 +12958,23 @@
                 <w:color w:val="003796"/>
                 <w:sz w:val="22"/>
               </w:rPr>
-              <w:t>☐  Keadaan kosong  halaman menampilkan pesan ketika penyaringan tidak menghasilkan isi</w:t>
+              <w:sym w:font="Wingdings 2" w:char="F052"/>
+            </w:r>
+            <w:r>
+              <w:rPr>
+                <w:rFonts w:cs="Carlito"/>
+                <w:color w:val="003796"/>
+                <w:sz w:val="22"/>
+              </w:rPr>
+              <w:t xml:space="preserve"> </w:t>
+            </w:r>
+            <w:r>
+              <w:rPr>
+                <w:rFonts w:cs="Carlito"/>
+                <w:color w:val="003796"/>
+                <w:sz w:val="22"/>
+              </w:rPr>
+              <w:t xml:space="preserve">  Keadaan kosong  halaman menampilkan pesan ketika penyaringan tidak menghasilkan isi</w:t>
             </w:r>
           </w:p>
         </w:tc>
@@ -12948,7 +13001,23 @@
                 <w:sz w:val="22"/>
               </w:rPr>
               <w:lastRenderedPageBreak/>
-              <w:t>☐  Validasi form  halaman tidak dimuat ulang, pesan galat muncul per kolom, dan tombol kirim menunggu sampai isinya layak</w:t>
+              <w:sym w:font="Wingdings 2" w:char="F052"/>
+            </w:r>
+            <w:r>
+              <w:rPr>
+                <w:rFonts w:cs="Carlito"/>
+                <w:color w:val="003796"/>
+                <w:sz w:val="22"/>
+              </w:rPr>
+              <w:t xml:space="preserve"> </w:t>
+            </w:r>
+            <w:r>
+              <w:rPr>
+                <w:rFonts w:cs="Carlito"/>
+                <w:color w:val="003796"/>
+                <w:sz w:val="22"/>
+              </w:rPr>
+              <w:t xml:space="preserve"> Validasi form  halaman tidak dimuat ulang, pesan galat muncul per kolom, dan tombol kirim menunggu sampai isinya layak</w:t>
             </w:r>
           </w:p>
         </w:tc>
@@ -12974,7 +13043,23 @@
                 <w:color w:val="003796"/>
                 <w:sz w:val="22"/>
               </w:rPr>
-              <w:t>☐  Deklarasi AI  bagian README menyebutkan bagian mana yang dibantu AI dan bagian mana yang Anda kerjakan sendiri</w:t>
+              <w:sym w:font="Wingdings 2" w:char="F052"/>
+            </w:r>
+            <w:r>
+              <w:rPr>
+                <w:rFonts w:cs="Carlito"/>
+                <w:color w:val="003796"/>
+                <w:sz w:val="22"/>
+              </w:rPr>
+              <w:t xml:space="preserve"> </w:t>
+            </w:r>
+            <w:r>
+              <w:rPr>
+                <w:rFonts w:cs="Carlito"/>
+                <w:color w:val="003796"/>
+                <w:sz w:val="22"/>
+              </w:rPr>
+              <w:t xml:space="preserve">  Deklarasi AI  bagian README menyebutkan bagian mana yang dibantu AI dan bagian mana yang Anda kerjakan sendiri</w:t>
             </w:r>
           </w:p>
         </w:tc>
@@ -13000,7 +13085,23 @@
                 <w:color w:val="003796"/>
                 <w:sz w:val="22"/>
               </w:rPr>
-              <w:t>☐  Git  ada lebih dari satu commit hari ini, dan pesan commit-nya menjelaskan isinya</w:t>
+              <w:sym w:font="Wingdings 2" w:char="F052"/>
+            </w:r>
+            <w:r>
+              <w:rPr>
+                <w:rFonts w:cs="Carlito"/>
+                <w:color w:val="003796"/>
+                <w:sz w:val="22"/>
+              </w:rPr>
+              <w:t xml:space="preserve"> </w:t>
+            </w:r>
+            <w:r>
+              <w:rPr>
+                <w:rFonts w:cs="Carlito"/>
+                <w:color w:val="003796"/>
+                <w:sz w:val="22"/>
+              </w:rPr>
+              <w:t xml:space="preserve">  Git  ada lebih dari satu commit hari ini, dan pesan commit-nya menjelaskan isinya</w:t>
             </w:r>
           </w:p>
         </w:tc>
@@ -13057,24 +13158,11 @@
               <w:right w:val="single" w:sz="4" w:space="0" w:color="B9C6E2"/>
             </w:tcBorders>
           </w:tcPr>
-          <w:p/>
-        </w:tc>
-      </w:tr>
-      <w:tr>
-        <w:trPr>
-          <w:trHeight w:val="351"/>
-        </w:trPr>
-        <w:tc>
-          <w:tcPr>
-            <w:tcW w:w="9751" w:type="dxa"/>
-            <w:tcBorders>
-              <w:top w:val="single" w:sz="4" w:space="0" w:color="B9C6E2"/>
-              <w:left w:val="single" w:sz="4" w:space="0" w:color="B9C6E2"/>
-              <w:bottom w:val="single" w:sz="4" w:space="0" w:color="B9C6E2"/>
-              <w:right w:val="single" w:sz="4" w:space="0" w:color="B9C6E2"/>
-            </w:tcBorders>
-          </w:tcPr>
-          <w:p/>
+          <w:p>
+            <w:r>
+              <w:t>Selalu pastikan wadah dibersihkan di awal fungsi render dan jaga kondisi logika validasi form agar tidak terjadi pencegahan kirim yang keliru.</w:t>
+            </w:r>
+          </w:p>
         </w:tc>
       </w:tr>
     </w:tbl>
@@ -13136,7 +13224,23 @@
                 <w:color w:val="003796"/>
                 <w:sz w:val="22"/>
               </w:rPr>
-              <w:t>☐  Pengungkapan AI  README menyebutkan bagian mana yang dibantu AI dan bagian mana yang saya kerjakan sendiri</w:t>
+              <w:sym w:font="Wingdings 2" w:char="F052"/>
+            </w:r>
+            <w:r>
+              <w:rPr>
+                <w:rFonts w:cs="Carlito"/>
+                <w:color w:val="003796"/>
+                <w:sz w:val="22"/>
+              </w:rPr>
+              <w:t xml:space="preserve"> </w:t>
+            </w:r>
+            <w:r>
+              <w:rPr>
+                <w:rFonts w:cs="Carlito"/>
+                <w:color w:val="003796"/>
+                <w:sz w:val="22"/>
+              </w:rPr>
+              <w:t xml:space="preserve"> Pengungkapan AI  README menyebutkan bagian mana yang dibantu AI dan bagian mana yang saya kerjakan sendiri</w:t>
             </w:r>
           </w:p>
         </w:tc>
@@ -13162,7 +13266,23 @@
                 <w:color w:val="003796"/>
                 <w:sz w:val="22"/>
               </w:rPr>
-              <w:t>☐  Keaslian  topik dan isi halaman ini milik saya sendiri, tidak menyalin pekerjaan mahasiswa lain</w:t>
+              <w:sym w:font="Wingdings 2" w:char="F052"/>
+            </w:r>
+            <w:r>
+              <w:rPr>
+                <w:rFonts w:cs="Carlito"/>
+                <w:color w:val="003796"/>
+                <w:sz w:val="22"/>
+              </w:rPr>
+              <w:t xml:space="preserve"> </w:t>
+            </w:r>
+            <w:r>
+              <w:rPr>
+                <w:rFonts w:cs="Carlito"/>
+                <w:color w:val="003796"/>
+                <w:sz w:val="22"/>
+              </w:rPr>
+              <w:t xml:space="preserve">  Keaslian  topik dan isi halaman ini milik saya sendiri, tidak menyalin pekerjaan mahasiswa lain</w:t>
             </w:r>
           </w:p>
         </w:tc>
@@ -13363,6 +13483,9 @@
             <w:pPr>
               <w:spacing w:before="20" w:after="20" w:line="252" w:lineRule="auto"/>
             </w:pPr>
+            <w:r>
+              <w:t>20</w:t>
+            </w:r>
           </w:p>
         </w:tc>
         <w:tc>
@@ -13379,6 +13502,9 @@
             <w:pPr>
               <w:spacing w:before="20" w:after="20" w:line="252" w:lineRule="auto"/>
             </w:pPr>
+            <w:r>
+              <w:t>js/dom.js (baris 3-5)</w:t>
+            </w:r>
           </w:p>
         </w:tc>
       </w:tr>
@@ -13448,6 +13574,9 @@
             <w:pPr>
               <w:spacing w:before="20" w:after="20" w:line="252" w:lineRule="auto"/>
             </w:pPr>
+            <w:r>
+              <w:t>25</w:t>
+            </w:r>
           </w:p>
         </w:tc>
         <w:tc>
@@ -13464,6 +13593,9 @@
             <w:pPr>
               <w:spacing w:before="20" w:after="20" w:line="252" w:lineRule="auto"/>
             </w:pPr>
+            <w:r>
+              <w:t>js/dom.js (fungsi render)</w:t>
+            </w:r>
           </w:p>
         </w:tc>
       </w:tr>
@@ -13533,6 +13665,9 @@
             <w:pPr>
               <w:spacing w:before="20" w:after="20" w:line="252" w:lineRule="auto"/>
             </w:pPr>
+            <w:r>
+              <w:t>25</w:t>
+            </w:r>
           </w:p>
         </w:tc>
         <w:tc>
@@ -13549,6 +13684,9 @@
             <w:pPr>
               <w:spacing w:before="20" w:after="20" w:line="252" w:lineRule="auto"/>
             </w:pPr>
+            <w:r>
+              <w:t>js/dom.js (baris barisFilter)</w:t>
+            </w:r>
           </w:p>
         </w:tc>
       </w:tr>
@@ -13618,6 +13756,9 @@
             <w:pPr>
               <w:spacing w:before="20" w:after="20" w:line="252" w:lineRule="auto"/>
             </w:pPr>
+            <w:r>
+              <w:t>20</w:t>
+            </w:r>
           </w:p>
         </w:tc>
         <w:tc>
@@ -13634,6 +13775,9 @@
             <w:pPr>
               <w:spacing w:before="20" w:after="20" w:line="252" w:lineRule="auto"/>
             </w:pPr>
+            <w:r>
+              <w:t>s/dom.js (fungsi periksaForm)</w:t>
+            </w:r>
           </w:p>
         </w:tc>
       </w:tr>
@@ -13703,6 +13847,9 @@
             <w:pPr>
               <w:spacing w:before="20" w:after="20" w:line="252" w:lineRule="auto"/>
             </w:pPr>
+            <w:r>
+              <w:t>10</w:t>
+            </w:r>
           </w:p>
         </w:tc>
         <w:tc>
@@ -13719,6 +13866,9 @@
             <w:pPr>
               <w:spacing w:before="20" w:after="20" w:line="252" w:lineRule="auto"/>
             </w:pPr>
+            <w:r>
+              <w:t>README.md</w:t>
+            </w:r>
           </w:p>
         </w:tc>
       </w:tr>
@@ -13788,6 +13938,9 @@
             <w:pPr>
               <w:spacing w:before="20" w:after="20" w:line="252" w:lineRule="auto"/>
             </w:pPr>
+            <w:r>
+              <w:t>100</w:t>
+            </w:r>
           </w:p>
         </w:tc>
         <w:tc>
@@ -13859,24 +14012,11 @@
               <w:right w:val="single" w:sz="4" w:space="0" w:color="B9C6E2"/>
             </w:tcBorders>
           </w:tcPr>
-          <w:p/>
-        </w:tc>
-      </w:tr>
-      <w:tr>
-        <w:trPr>
-          <w:trHeight w:val="351"/>
-        </w:trPr>
-        <w:tc>
-          <w:tcPr>
-            <w:tcW w:w="9751" w:type="dxa"/>
-            <w:tcBorders>
-              <w:top w:val="single" w:sz="4" w:space="0" w:color="B9C6E2"/>
-              <w:left w:val="single" w:sz="4" w:space="0" w:color="B9C6E2"/>
-              <w:bottom w:val="single" w:sz="4" w:space="0" w:color="B9C6E2"/>
-              <w:right w:val="single" w:sz="4" w:space="0" w:color="B9C6E2"/>
-            </w:tcBorders>
-          </w:tcPr>
-          <w:p/>
+          <w:p>
+            <w:r>
+              <w:t>Menyesuaikan logika validasi form agar pesan galat dan tombol kirim dapat bekerja secara sinkron tanpa error.</w:t>
+            </w:r>
+          </w:p>
         </w:tc>
       </w:tr>
     </w:tbl>
@@ -13917,24 +14057,11 @@
               <w:right w:val="single" w:sz="4" w:space="0" w:color="B9C6E2"/>
             </w:tcBorders>
           </w:tcPr>
-          <w:p/>
-        </w:tc>
-      </w:tr>
-      <w:tr>
-        <w:trPr>
-          <w:trHeight w:val="351"/>
-        </w:trPr>
-        <w:tc>
-          <w:tcPr>
-            <w:tcW w:w="9751" w:type="dxa"/>
-            <w:tcBorders>
-              <w:top w:val="single" w:sz="4" w:space="0" w:color="B9C6E2"/>
-              <w:left w:val="single" w:sz="4" w:space="0" w:color="B9C6E2"/>
-              <w:bottom w:val="single" w:sz="4" w:space="0" w:color="B9C6E2"/>
-              <w:right w:val="single" w:sz="4" w:space="0" w:color="B9C6E2"/>
-            </w:tcBorders>
-          </w:tcPr>
-          <w:p/>
+          <w:p>
+            <w:r>
+              <w:t>Cara penanganan struktur modul JavaScript dan praktik terbaik dalam optimasi performa DOM.</w:t>
+            </w:r>
+          </w:p>
         </w:tc>
       </w:tr>
     </w:tbl>
@@ -13949,7 +14076,42 @@
           <w:rFonts w:cs="Carlito"/>
           <w:sz w:val="20"/>
         </w:rPr>
-        <w:t>Tanda tangan: ______________________________     Tanggal: ______________     Jam selesai: __________</w:t>
+        <w:t xml:space="preserve">Tanda tangan: </w:t>
+      </w:r>
+      <w:r>
+        <w:rPr>
+          <w:rFonts w:cs="Carlito"/>
+          <w:sz w:val="20"/>
+        </w:rPr>
+        <w:t>Diah Putri Pertiwi</w:t>
+      </w:r>
+      <w:r>
+        <w:rPr>
+          <w:rFonts w:cs="Carlito"/>
+          <w:sz w:val="20"/>
+        </w:rPr>
+        <w:t xml:space="preserve">     Tanggal: </w:t>
+      </w:r>
+      <w:r>
+        <w:rPr>
+          <w:rFonts w:cs="Carlito"/>
+          <w:sz w:val="20"/>
+        </w:rPr>
+        <w:t>08 oktober 2026</w:t>
+      </w:r>
+      <w:r>
+        <w:rPr>
+          <w:rFonts w:cs="Carlito"/>
+          <w:sz w:val="20"/>
+        </w:rPr>
+        <w:t xml:space="preserve">    Jam selesai:</w:t>
+      </w:r>
+      <w:r>
+        <w:rPr>
+          <w:rFonts w:cs="Carlito"/>
+          <w:sz w:val="20"/>
+        </w:rPr>
+        <w:t xml:space="preserve"> 22:30</w:t>
       </w:r>
     </w:p>
     <w:p>

</xml_diff>

<commit_message>
P9 - last update
</commit_message>
<xml_diff>
--- a/worksheet-p9/25523236-Diah Putri Pertiwi.docx
+++ b/worksheet-p9/25523236-Diah Putri Pertiwi.docx
@@ -12798,15 +12798,7 @@
                 <w:color w:val="003796"/>
                 <w:sz w:val="22"/>
               </w:rPr>
-              <w:t xml:space="preserve"> </w:t>
-            </w:r>
-            <w:r>
-              <w:rPr>
-                <w:rFonts w:cs="Carlito"/>
-                <w:color w:val="003796"/>
-                <w:sz w:val="22"/>
-              </w:rPr>
-              <w:t xml:space="preserve">  Pemilih  setiap pemilih menghasilkan elemen; tidak ada satu pun yang bernilai null</w:t>
+              <w:t xml:space="preserve">   Pemilih  setiap pemilih menghasilkan elemen; tidak ada satu pun yang bernilai null</w:t>
             </w:r>
           </w:p>
         </w:tc>
@@ -12840,15 +12832,7 @@
                 <w:color w:val="003796"/>
                 <w:sz w:val="22"/>
               </w:rPr>
-              <w:t xml:space="preserve"> </w:t>
-            </w:r>
-            <w:r>
-              <w:rPr>
-                <w:rFonts w:cs="Carlito"/>
-                <w:color w:val="003796"/>
-                <w:sz w:val="22"/>
-              </w:rPr>
-              <w:t xml:space="preserve"> Render dari data  daftar proyek terbentuk dari array dengan createElement dan textContent, bukan dari HTML yang ditulis tangan</w:t>
+              <w:t xml:space="preserve">  Render dari data  daftar proyek terbentuk dari array dengan createElement dan textContent, bukan dari HTML yang ditulis tangan</w:t>
             </w:r>
           </w:p>
         </w:tc>
@@ -12882,15 +12866,7 @@
                 <w:color w:val="003796"/>
                 <w:sz w:val="22"/>
               </w:rPr>
-              <w:t xml:space="preserve"> </w:t>
-            </w:r>
-            <w:r>
-              <w:rPr>
-                <w:rFonts w:cs="Carlito"/>
-                <w:color w:val="003796"/>
-                <w:sz w:val="22"/>
-              </w:rPr>
-              <w:t xml:space="preserve">  Wadah  dikosongkan di baris pertama fungsi render, sehingga kartu tidak pernah berlipat</w:t>
+              <w:t xml:space="preserve">   Wadah  dikosongkan di baris pertama fungsi render, sehingga kartu tidak pernah berlipat</w:t>
             </w:r>
           </w:p>
         </w:tc>
@@ -12924,15 +12900,7 @@
                 <w:color w:val="003796"/>
                 <w:sz w:val="22"/>
               </w:rPr>
-              <w:t xml:space="preserve"> </w:t>
-            </w:r>
-            <w:r>
-              <w:rPr>
-                <w:rFonts w:cs="Carlito"/>
-                <w:color w:val="003796"/>
-                <w:sz w:val="22"/>
-              </w:rPr>
-              <w:t xml:space="preserve">  Event delegation  satu pendengar di induk melayani semua tombol filter; event.target dan closest dipakai benar</w:t>
+              <w:t xml:space="preserve">   Event delegation  satu pendengar di induk melayani semua tombol filter; event.target dan closest dipakai benar</w:t>
             </w:r>
           </w:p>
         </w:tc>
@@ -12966,15 +12934,7 @@
                 <w:color w:val="003796"/>
                 <w:sz w:val="22"/>
               </w:rPr>
-              <w:t xml:space="preserve"> </w:t>
-            </w:r>
-            <w:r>
-              <w:rPr>
-                <w:rFonts w:cs="Carlito"/>
-                <w:color w:val="003796"/>
-                <w:sz w:val="22"/>
-              </w:rPr>
-              <w:t xml:space="preserve">  Keadaan kosong  halaman menampilkan pesan ketika penyaringan tidak menghasilkan isi</w:t>
+              <w:t xml:space="preserve">   Keadaan kosong  halaman menampilkan pesan ketika penyaringan tidak menghasilkan isi</w:t>
             </w:r>
           </w:p>
         </w:tc>
@@ -13009,15 +12969,7 @@
                 <w:color w:val="003796"/>
                 <w:sz w:val="22"/>
               </w:rPr>
-              <w:t xml:space="preserve"> </w:t>
-            </w:r>
-            <w:r>
-              <w:rPr>
-                <w:rFonts w:cs="Carlito"/>
-                <w:color w:val="003796"/>
-                <w:sz w:val="22"/>
-              </w:rPr>
-              <w:t xml:space="preserve"> Validasi form  halaman tidak dimuat ulang, pesan galat muncul per kolom, dan tombol kirim menunggu sampai isinya layak</w:t>
+              <w:t xml:space="preserve">  Validasi form  halaman tidak dimuat ulang, pesan galat muncul per kolom, dan tombol kirim menunggu sampai isinya layak</w:t>
             </w:r>
           </w:p>
         </w:tc>
@@ -13051,15 +13003,7 @@
                 <w:color w:val="003796"/>
                 <w:sz w:val="22"/>
               </w:rPr>
-              <w:t xml:space="preserve"> </w:t>
-            </w:r>
-            <w:r>
-              <w:rPr>
-                <w:rFonts w:cs="Carlito"/>
-                <w:color w:val="003796"/>
-                <w:sz w:val="22"/>
-              </w:rPr>
-              <w:t xml:space="preserve">  Deklarasi AI  bagian README menyebutkan bagian mana yang dibantu AI dan bagian mana yang Anda kerjakan sendiri</w:t>
+              <w:t xml:space="preserve">   Deklarasi AI  bagian README menyebutkan bagian mana yang dibantu AI dan bagian mana yang Anda kerjakan sendiri</w:t>
             </w:r>
           </w:p>
         </w:tc>
@@ -13093,15 +13037,7 @@
                 <w:color w:val="003796"/>
                 <w:sz w:val="22"/>
               </w:rPr>
-              <w:t xml:space="preserve"> </w:t>
-            </w:r>
-            <w:r>
-              <w:rPr>
-                <w:rFonts w:cs="Carlito"/>
-                <w:color w:val="003796"/>
-                <w:sz w:val="22"/>
-              </w:rPr>
-              <w:t xml:space="preserve">  Git  ada lebih dari satu commit hari ini, dan pesan commit-nya menjelaskan isinya</w:t>
+              <w:t xml:space="preserve">   Git  ada lebih dari satu commit hari ini, dan pesan commit-nya menjelaskan isinya</w:t>
             </w:r>
           </w:p>
         </w:tc>
@@ -13232,15 +13168,7 @@
                 <w:color w:val="003796"/>
                 <w:sz w:val="22"/>
               </w:rPr>
-              <w:t xml:space="preserve"> </w:t>
-            </w:r>
-            <w:r>
-              <w:rPr>
-                <w:rFonts w:cs="Carlito"/>
-                <w:color w:val="003796"/>
-                <w:sz w:val="22"/>
-              </w:rPr>
-              <w:t xml:space="preserve"> Pengungkapan AI  README menyebutkan bagian mana yang dibantu AI dan bagian mana yang saya kerjakan sendiri</w:t>
+              <w:t xml:space="preserve">  Pengungkapan AI  README menyebutkan bagian mana yang dibantu AI dan bagian mana yang saya kerjakan sendiri</w:t>
             </w:r>
           </w:p>
         </w:tc>
@@ -13274,15 +13202,7 @@
                 <w:color w:val="003796"/>
                 <w:sz w:val="22"/>
               </w:rPr>
-              <w:t xml:space="preserve"> </w:t>
-            </w:r>
-            <w:r>
-              <w:rPr>
-                <w:rFonts w:cs="Carlito"/>
-                <w:color w:val="003796"/>
-                <w:sz w:val="22"/>
-              </w:rPr>
-              <w:t xml:space="preserve">  Keaslian  topik dan isi halaman ini milik saya sendiri, tidak menyalin pekerjaan mahasiswa lain</w:t>
+              <w:t xml:space="preserve">   Keaslian  topik dan isi halaman ini milik saya sendiri, tidak menyalin pekerjaan mahasiswa lain</w:t>
             </w:r>
           </w:p>
         </w:tc>
@@ -15482,6 +15402,9 @@
             <w:pPr>
               <w:spacing w:before="20" w:after="20" w:line="252" w:lineRule="auto"/>
             </w:pPr>
+            <w:r>
+              <w:t>Saat ingin mengambil satu elemen spesifik pertama di halaman.</w:t>
+            </w:r>
           </w:p>
         </w:tc>
       </w:tr>
@@ -15551,6 +15474,9 @@
             <w:pPr>
               <w:spacing w:before="20" w:after="20" w:line="252" w:lineRule="auto"/>
             </w:pPr>
+            <w:r>
+              <w:t>Saat ingin mengambil banyak elemen sekaligus dalam bentuk NodeList.</w:t>
+            </w:r>
           </w:p>
         </w:tc>
       </w:tr>
@@ -15620,6 +15546,9 @@
             <w:pPr>
               <w:spacing w:before="20" w:after="20" w:line="252" w:lineRule="auto"/>
             </w:pPr>
+            <w:r>
+              <w:t>Sebelum melakukan map atau filter pada hasil querySelectorAll.</w:t>
+            </w:r>
           </w:p>
         </w:tc>
       </w:tr>
@@ -15689,6 +15618,9 @@
             <w:pPr>
               <w:spacing w:before="20" w:after="20" w:line="252" w:lineRule="auto"/>
             </w:pPr>
+            <w:r>
+              <w:t>Saat ingin menyusun elemen HTML baru lewat JavaScript.</w:t>
+            </w:r>
           </w:p>
         </w:tc>
       </w:tr>
@@ -15758,6 +15690,9 @@
             <w:pPr>
               <w:spacing w:before="20" w:after="20" w:line="252" w:lineRule="auto"/>
             </w:pPr>
+            <w:r>
+              <w:t>Saat mengisi teks ke dalam elemen secara aman dari XSS.</w:t>
+            </w:r>
           </w:p>
         </w:tc>
       </w:tr>
@@ -15827,6 +15762,9 @@
             <w:pPr>
               <w:spacing w:before="20" w:after="20" w:line="252" w:lineRule="auto"/>
             </w:pPr>
+            <w:r>
+              <w:t>Saat memasukkan elemen baru ke dalam wadah (container).</w:t>
+            </w:r>
           </w:p>
         </w:tc>
       </w:tr>
@@ -15896,6 +15834,9 @@
             <w:pPr>
               <w:spacing w:before="20" w:after="20" w:line="252" w:lineRule="auto"/>
             </w:pPr>
+            <w:r>
+              <w:t>Saat mengosongkan seluruh anak dari suatu wadah.</w:t>
+            </w:r>
           </w:p>
         </w:tc>
       </w:tr>
@@ -15965,6 +15906,9 @@
             <w:pPr>
               <w:spacing w:before="20" w:after="20" w:line="252" w:lineRule="auto"/>
             </w:pPr>
+            <w:r>
+              <w:t>Saat menambah atau melepas kelas CSS secara bergantian.</w:t>
+            </w:r>
           </w:p>
         </w:tc>
       </w:tr>
@@ -15993,6 +15937,7 @@
                 <w:rFonts w:cs="Carlito"/>
                 <w:sz w:val="19"/>
               </w:rPr>
+              <w:lastRenderedPageBreak/>
               <w:t>addEventListener</w:t>
             </w:r>
           </w:p>
@@ -16034,6 +15979,9 @@
             <w:pPr>
               <w:spacing w:before="20" w:after="20" w:line="252" w:lineRule="auto"/>
             </w:pPr>
+            <w:r>
+              <w:t>Saat memasang pendengar aksi (event listener) pada elemen.</w:t>
+            </w:r>
           </w:p>
         </w:tc>
       </w:tr>
@@ -16103,6 +16051,9 @@
             <w:pPr>
               <w:spacing w:before="20" w:after="20" w:line="252" w:lineRule="auto"/>
             </w:pPr>
+            <w:r>
+              <w:t>Saat mencari elemen induk terdekat dari bagian yang diklik.</w:t>
+            </w:r>
           </w:p>
         </w:tc>
       </w:tr>
@@ -16131,7 +16082,6 @@
                 <w:rFonts w:cs="Carlito"/>
                 <w:sz w:val="19"/>
               </w:rPr>
-              <w:lastRenderedPageBreak/>
               <w:t>preventDefault()</w:t>
             </w:r>
           </w:p>
@@ -16173,6 +16123,9 @@
             <w:pPr>
               <w:spacing w:before="20" w:after="20" w:line="252" w:lineRule="auto"/>
             </w:pPr>
+            <w:r>
+              <w:t>Saat menahan aksi bawaan peramban (misal agar form tidak reload).</w:t>
+            </w:r>
           </w:p>
         </w:tc>
       </w:tr>
@@ -16242,6 +16195,9 @@
             <w:pPr>
               <w:spacing w:before="20" w:after="20" w:line="252" w:lineRule="auto"/>
             </w:pPr>
+            <w:r>
+              <w:t>Saat membaca atribut data-* yang disematkan di elemen HTML.</w:t>
+            </w:r>
           </w:p>
         </w:tc>
       </w:tr>
@@ -17505,6 +17461,7 @@
                 <w:rFonts w:cs="Carlito"/>
                 <w:sz w:val="18"/>
               </w:rPr>
+              <w:lastRenderedPageBreak/>
               <w:t>git push</w:t>
             </w:r>
           </w:p>
@@ -17594,17 +17551,7 @@
                 <w:color w:val="003796"/>
                 <w:sz w:val="20"/>
               </w:rPr>
-              <w:t xml:space="preserve">Titik pada git add .  Titik itu berarti "seluruh berkas di folder ini".  Tanpa titik, Git tidak tahu apa yang harus disimpan. Hal yang sama berlaku untuk berkas dom.js yang baru Anda buat — ia ikut tersimpan </w:t>
-            </w:r>
-            <w:r>
-              <w:rPr>
-                <w:rFonts w:cs="Carlito"/>
-                <w:b/>
-                <w:color w:val="003796"/>
-                <w:sz w:val="20"/>
-              </w:rPr>
-              <w:lastRenderedPageBreak/>
-              <w:t>karena berada di dalam folder semester.</w:t>
+              <w:t>Titik pada git add .  Titik itu berarti "seluruh berkas di folder ini".  Tanpa titik, Git tidak tahu apa yang harus disimpan. Hal yang sama berlaku untuk berkas dom.js yang baru Anda buat — ia ikut tersimpan karena berada di dalam folder semester.</w:t>
             </w:r>
           </w:p>
         </w:tc>

</xml_diff>